<commit_message>
feat: align ground and flight TC security
Fix ordinary TC to SM4-HCTR and recovery root preparation to SM4-GCM, align the Go and freestanding C wire/KDF/state contracts, harden flight state handling, and remove obsolete AES/CTR compatibility paths. Add shared vectors, strict plaintext validation design, expanded failure-path tests, and a mandatory 95 percent coverage gate.
</commit_message>
<xml_diff>
--- a/docs/星务软件内置星载密码系统功能与交互说明_v0.8.docx
+++ b/docs/星务软件内置星载密码系统功能与交互说明_v0.8.docx
@@ -620,11 +620,6 @@
       <w:r>
         <w:t>Current/Next 安全关联自动切换，以及独立 Recovery GCM 通道的 Operational Root Prepare。</w:t>
       </w:r>
-      <w:r>
-        <w:rPr>
-          <w:lang w:eastAsia="zh-CN"/>
-        </w:rPr>
-      </w:r>
     </w:p>
     <w:p>
       <w:pPr>
@@ -1391,9 +1386,13 @@
         <w:pStyle w:val="a0"/>
         <w:rPr>
           <w:rFonts w:hint="eastAsia"/>
+          <w:lang w:eastAsia="zh-CN"/>
         </w:rPr>
       </w:pPr>
       <w:r>
+        <w:rPr>
+          <w:lang w:eastAsia="zh-CN"/>
+        </w:rPr>
         <w:t>禁止逐帧调用动态携带或选择 Root、工作密钥、SPI、IV、nonce prefix、算法模式或安全关联状态。</w:t>
       </w:r>
     </w:p>
@@ -3133,7 +3132,10 @@
         <w:pStyle w:val="1"/>
       </w:pPr>
       <w:r>
-        <w:t>4. 星务软件内部集成机制</w:t>
+        <w:t xml:space="preserve">4. </w:t>
+      </w:r>
+      <w:r>
+        <w:t>星务软件内部集成机制</w:t>
       </w:r>
     </w:p>
     <w:p>
@@ -3168,7 +3170,10 @@
         <w:pStyle w:val="21"/>
       </w:pPr>
       <w:r>
-        <w:t>4.1 通用调用与回调机制</w:t>
+        <w:t xml:space="preserve">4.1 </w:t>
+      </w:r>
+      <w:r>
+        <w:t>通用调用与回调机制</w:t>
       </w:r>
     </w:p>
     <w:p>
@@ -3185,10 +3190,17 @@
         <w:ind w:left="115" w:right="115"/>
         <w:rPr>
           <w:rFonts w:hint="eastAsia"/>
+          <w:lang w:eastAsia="zh-CN"/>
         </w:rPr>
       </w:pPr>
       <w:r>
-        <w:t>当前公开接口固定为 tcsec_init、tcsec_receive、tcsec_clear 和诊断辅助 tcsec_status_string。初始化必须提供 tcsec_plaintext_validator_fn 与 tcsec_state_commit_fn，并传入中性的 user_context。回调实现属于星务适配层；密码模块只控制调用时序和失败语义。</w:t>
+        <w:t>当前公开接口固定为 tcsec_init、tcsec_receive、tcsec_clear 和诊断辅助 tcsec_status_string。初始化必须提供 tcsec_plaintext_validator_fn 与 tcsec_state_commit_fn，并传入中性的 user_context。</w:t>
+      </w:r>
+      <w:r>
+        <w:rPr>
+          <w:lang w:eastAsia="zh-CN"/>
+        </w:rPr>
+        <w:t>回调实现属于星务适配层；密码模块只控制调用时序和失败语义。</w:t>
       </w:r>
     </w:p>
     <w:tbl>
@@ -3200,9 +3212,9 @@
         <w:tblLook w:val="04A0" w:firstRow="1" w:lastRow="0" w:firstColumn="1" w:lastColumn="0" w:noHBand="0" w:noVBand="1"/>
       </w:tblPr>
       <w:tblGrid>
-        <w:gridCol w:w="1600"/>
-        <w:gridCol w:w="2100"/>
-        <w:gridCol w:w="2850"/>
+        <w:gridCol w:w="1418"/>
+        <w:gridCol w:w="1984"/>
+        <w:gridCol w:w="3148"/>
         <w:gridCol w:w="2810"/>
       </w:tblGrid>
       <w:tr>
@@ -3212,7 +3224,7 @@
         </w:trPr>
         <w:tc>
           <w:tcPr>
-            <w:tcW w:w="1600" w:type="dxa"/>
+            <w:tcW w:w="1418" w:type="dxa"/>
             <w:tcBorders>
               <w:top w:val="single" w:sz="4" w:space="0" w:color="C8D0DA"/>
               <w:left w:val="single" w:sz="4" w:space="0" w:color="C8D0DA"/>
@@ -3248,7 +3260,7 @@
         </w:tc>
         <w:tc>
           <w:tcPr>
-            <w:tcW w:w="2100" w:type="dxa"/>
+            <w:tcW w:w="1984" w:type="dxa"/>
             <w:tcBorders>
               <w:top w:val="single" w:sz="4" w:space="0" w:color="C8D0DA"/>
               <w:left w:val="single" w:sz="4" w:space="0" w:color="C8D0DA"/>
@@ -3284,7 +3296,7 @@
         </w:tc>
         <w:tc>
           <w:tcPr>
-            <w:tcW w:w="2850" w:type="dxa"/>
+            <w:tcW w:w="3148" w:type="dxa"/>
             <w:tcBorders>
               <w:top w:val="single" w:sz="4" w:space="0" w:color="C8D0DA"/>
               <w:left w:val="single" w:sz="4" w:space="0" w:color="C8D0DA"/>
@@ -3361,7 +3373,7 @@
         </w:trPr>
         <w:tc>
           <w:tcPr>
-            <w:tcW w:w="1600" w:type="dxa"/>
+            <w:tcW w:w="1418" w:type="dxa"/>
             <w:tcBorders>
               <w:top w:val="single" w:sz="4" w:space="0" w:color="C8D0DA"/>
               <w:left w:val="single" w:sz="4" w:space="0" w:color="C8D0DA"/>
@@ -3393,7 +3405,7 @@
         </w:tc>
         <w:tc>
           <w:tcPr>
-            <w:tcW w:w="2100" w:type="dxa"/>
+            <w:tcW w:w="1984" w:type="dxa"/>
             <w:tcBorders>
               <w:top w:val="single" w:sz="4" w:space="0" w:color="C8D0DA"/>
               <w:left w:val="single" w:sz="4" w:space="0" w:color="C8D0DA"/>
@@ -3418,16 +3430,17 @@
             </w:pPr>
             <w:r>
               <w:rPr>
+                <w:rFonts w:hint="eastAsia"/>
                 <w:sz w:val="17"/>
                 <w:lang w:eastAsia="zh-CN"/>
               </w:rPr>
-              <w:t>启动或复位恢复</w:t>
-            </w:r>
-          </w:p>
-        </w:tc>
-        <w:tc>
-          <w:tcPr>
-            <w:tcW w:w="2850" w:type="dxa"/>
+              <w:t>星务启动自动触发</w:t>
+            </w:r>
+          </w:p>
+        </w:tc>
+        <w:tc>
+          <w:tcPr>
+            <w:tcW w:w="3148" w:type="dxa"/>
             <w:tcBorders>
               <w:top w:val="single" w:sz="4" w:space="0" w:color="C8D0DA"/>
               <w:left w:val="single" w:sz="4" w:space="0" w:color="C8D0DA"/>
@@ -3455,7 +3468,22 @@
                 <w:sz w:val="17"/>
                 <w:lang w:eastAsia="zh-CN"/>
               </w:rPr>
-              <w:t>输入 tcsec_config_t、plaintext validator、state commit 与 user_context；模块校验配置并派生 Current/Next/Recovery 工作密钥。</w:t>
+              <w:t xml:space="preserve">输入 tcsec_config_t、plaintext validator、state commit 与 </w:t>
+            </w:r>
+            <w:r>
+              <w:rPr>
+                <w:rFonts w:hint="eastAsia"/>
+                <w:sz w:val="17"/>
+                <w:lang w:eastAsia="zh-CN"/>
+              </w:rPr>
+              <w:t>用户上下文，遥测回调</w:t>
+            </w:r>
+            <w:r>
+              <w:rPr>
+                <w:sz w:val="17"/>
+                <w:lang w:eastAsia="zh-CN"/>
+              </w:rPr>
+              <w:t>；模块校验配置并派生 Current/Next/Recovery 工作密钥。</w:t>
             </w:r>
           </w:p>
         </w:tc>
@@ -3500,7 +3528,7 @@
         </w:trPr>
         <w:tc>
           <w:tcPr>
-            <w:tcW w:w="1600" w:type="dxa"/>
+            <w:tcW w:w="1418" w:type="dxa"/>
             <w:tcBorders>
               <w:top w:val="single" w:sz="4" w:space="0" w:color="C8D0DA"/>
               <w:left w:val="single" w:sz="4" w:space="0" w:color="C8D0DA"/>
@@ -3532,7 +3560,7 @@
         </w:tc>
         <w:tc>
           <w:tcPr>
-            <w:tcW w:w="2100" w:type="dxa"/>
+            <w:tcW w:w="1984" w:type="dxa"/>
             <w:tcBorders>
               <w:top w:val="single" w:sz="4" w:space="0" w:color="C8D0DA"/>
               <w:left w:val="single" w:sz="4" w:space="0" w:color="C8D0DA"/>
@@ -3566,7 +3594,7 @@
         </w:tc>
         <w:tc>
           <w:tcPr>
-            <w:tcW w:w="2850" w:type="dxa"/>
+            <w:tcW w:w="3148" w:type="dxa"/>
             <w:tcBorders>
               <w:top w:val="single" w:sz="4" w:space="0" w:color="C8D0DA"/>
               <w:left w:val="single" w:sz="4" w:space="0" w:color="C8D0DA"/>
@@ -3639,7 +3667,7 @@
         </w:trPr>
         <w:tc>
           <w:tcPr>
-            <w:tcW w:w="1600" w:type="dxa"/>
+            <w:tcW w:w="1418" w:type="dxa"/>
             <w:tcBorders>
               <w:top w:val="single" w:sz="4" w:space="0" w:color="C8D0DA"/>
               <w:left w:val="single" w:sz="4" w:space="0" w:color="C8D0DA"/>
@@ -3666,6 +3694,11 @@
                 <w:sz w:val="16"/>
               </w:rPr>
               <w:t>tcsec_clear /</w:t>
+            </w:r>
+            <w:r>
+              <w:rPr>
+                <w:sz w:val="16"/>
+              </w:rPr>
               <w:br/>
               <w:t>status helper</w:t>
             </w:r>
@@ -3673,7 +3706,7 @@
         </w:tc>
         <w:tc>
           <w:tcPr>
-            <w:tcW w:w="2100" w:type="dxa"/>
+            <w:tcW w:w="1984" w:type="dxa"/>
             <w:tcBorders>
               <w:top w:val="single" w:sz="4" w:space="0" w:color="C8D0DA"/>
               <w:left w:val="single" w:sz="4" w:space="0" w:color="C8D0DA"/>
@@ -3707,7 +3740,7 @@
         </w:tc>
         <w:tc>
           <w:tcPr>
-            <w:tcW w:w="2850" w:type="dxa"/>
+            <w:tcW w:w="3148" w:type="dxa"/>
             <w:tcBorders>
               <w:top w:val="single" w:sz="4" w:space="0" w:color="C8D0DA"/>
               <w:left w:val="single" w:sz="4" w:space="0" w:color="C8D0DA"/>
@@ -3938,6 +3971,7 @@
               <w:rPr>
                 <w:sz w:val="18"/>
               </w:rPr>
+              <w:lastRenderedPageBreak/>
               <w:t>适用对象</w:t>
             </w:r>
           </w:p>
@@ -4251,8 +4285,15 @@
             <w:r>
               <w:rPr>
                 <w:sz w:val="18"/>
-              </w:rPr>
-              <w:t>拒绝时不提交状态、不返回明文。该校验不等同于 Tag/MAC。</w:t>
+                <w:lang w:eastAsia="zh-CN"/>
+              </w:rPr>
+              <w:t>拒绝时不提交状态、不返回明文。</w:t>
+            </w:r>
+            <w:r>
+              <w:rPr>
+                <w:sz w:val="18"/>
+              </w:rPr>
+              <w:t>该校验不等同于 Tag/MAC。</w:t>
             </w:r>
           </w:p>
         </w:tc>
@@ -4468,11 +4509,13 @@
               <w:spacing w:after="0" w:line="259" w:lineRule="auto"/>
               <w:rPr>
                 <w:rFonts w:hint="eastAsia"/>
+                <w:lang w:eastAsia="zh-CN"/>
               </w:rPr>
             </w:pPr>
             <w:r>
               <w:rPr>
                 <w:sz w:val="17"/>
+                <w:lang w:eastAsia="zh-CN"/>
               </w:rPr>
               <w:t>当前安全关联的防重放状态必须整体持久化，并保证掉电恢复后不回退。</w:t>
             </w:r>
@@ -4500,11 +4543,13 @@
               <w:spacing w:after="0" w:line="259" w:lineRule="auto"/>
               <w:rPr>
                 <w:rFonts w:hint="eastAsia"/>
+                <w:lang w:eastAsia="zh-CN"/>
               </w:rPr>
             </w:pPr>
             <w:r>
               <w:rPr>
                 <w:sz w:val="17"/>
+                <w:lang w:eastAsia="zh-CN"/>
               </w:rPr>
               <w:t>一致的重复事务可识别并安全确认。</w:t>
             </w:r>
@@ -4569,11 +4614,13 @@
               <w:spacing w:after="0" w:line="259" w:lineRule="auto"/>
               <w:rPr>
                 <w:rFonts w:hint="eastAsia"/>
+                <w:lang w:eastAsia="zh-CN"/>
               </w:rPr>
             </w:pPr>
             <w:r>
               <w:rPr>
                 <w:sz w:val="17"/>
+                <w:lang w:eastAsia="zh-CN"/>
               </w:rPr>
               <w:t>新旧安全关联切换、相关状态清理和后续准备必须作为一个事务完成。</w:t>
             </w:r>
@@ -4704,11 +4751,13 @@
               <w:spacing w:after="0" w:line="259" w:lineRule="auto"/>
               <w:rPr>
                 <w:rFonts w:hint="eastAsia"/>
+                <w:lang w:eastAsia="zh-CN"/>
               </w:rPr>
             </w:pPr>
             <w:r>
               <w:rPr>
                 <w:sz w:val="17"/>
+                <w:lang w:eastAsia="zh-CN"/>
               </w:rPr>
               <w:t>同一事务的一致重试可识别；冲突重试必须拒绝。</w:t>
             </w:r>
@@ -4721,6 +4770,7 @@
         <w:spacing w:after="40"/>
         <w:rPr>
           <w:rFonts w:hint="eastAsia"/>
+          <w:lang w:eastAsia="zh-CN"/>
         </w:rPr>
       </w:pPr>
     </w:p>
@@ -4798,36 +4848,6 @@
         </w:rPr>
         <w:t>读控制：星务启动或受控恢复时读取完整安全状态一次并建立 RAM 上下文；正常逐帧处理和健康查询不轮询 NVM。</w:t>
       </w:r>
-      <w:r>
-        <w:rPr>
-          <w:lang w:eastAsia="zh-CN"/>
-        </w:rPr>
-      </w:r>
-      <w:r>
-        <w:rPr>
-          <w:lang w:eastAsia="zh-CN"/>
-        </w:rPr>
-      </w:r>
-      <w:r>
-        <w:rPr>
-          <w:lang w:eastAsia="zh-CN"/>
-        </w:rPr>
-      </w:r>
-      <w:r>
-        <w:rPr>
-          <w:lang w:eastAsia="zh-CN"/>
-        </w:rPr>
-      </w:r>
-      <w:r>
-        <w:rPr>
-          <w:lang w:eastAsia="zh-CN"/>
-        </w:rPr>
-      </w:r>
-      <w:r>
-        <w:rPr>
-          <w:lang w:eastAsia="zh-CN"/>
-        </w:rPr>
-      </w:r>
     </w:p>
     <w:p>
       <w:pPr>
@@ -4852,37 +4872,8 @@
         <w:rPr>
           <w:lang w:eastAsia="zh-CN"/>
         </w:rPr>
+        <w:lastRenderedPageBreak/>
         <w:t>当前合同不实现异步批量提交或隐式高水位预留；state_commit 返回成功前，相应状态必须已具备掉电后可恢复的持久化保证。</w:t>
-      </w:r>
-      <w:r>
-        <w:rPr>
-          <w:lang w:eastAsia="zh-CN"/>
-        </w:rPr>
-      </w:r>
-      <w:r>
-        <w:rPr>
-          <w:lang w:eastAsia="zh-CN"/>
-        </w:rPr>
-      </w:r>
-      <w:r>
-        <w:rPr>
-          <w:lang w:eastAsia="zh-CN"/>
-        </w:rPr>
-      </w:r>
-      <w:r>
-        <w:rPr>
-          <w:lang w:eastAsia="zh-CN"/>
-        </w:rPr>
-      </w:r>
-      <w:r>
-        <w:rPr>
-          <w:lang w:eastAsia="zh-CN"/>
-        </w:rPr>
-      </w:r>
-      <w:r>
-        <w:rPr>
-          <w:lang w:eastAsia="zh-CN"/>
-        </w:rPr>
       </w:r>
     </w:p>
     <w:p>
@@ -4899,26 +4890,6 @@
         </w:rPr>
         <w:t>介质选择：若逐帧 replay 提交超过 EEPROM/Flash 耐久预算，应采用 FRAM/MRAM、A/B 日志或等效高耐久原子存储适配，不得通过跳过提交降低写次数。</w:t>
       </w:r>
-      <w:r>
-        <w:rPr>
-          <w:lang w:eastAsia="zh-CN"/>
-        </w:rPr>
-      </w:r>
-      <w:r>
-        <w:rPr>
-          <w:lang w:eastAsia="zh-CN"/>
-        </w:rPr>
-      </w:r>
-      <w:r>
-        <w:rPr>
-          <w:lang w:eastAsia="zh-CN"/>
-        </w:rPr>
-      </w:r>
-      <w:r>
-        <w:rPr>
-          <w:lang w:eastAsia="zh-CN"/>
-        </w:rPr>
-      </w:r>
     </w:p>
     <w:p>
       <w:pPr>
@@ -4928,37 +4899,7 @@
         </w:rPr>
       </w:pPr>
       <w:r>
-        <w:t>介质保护：</w:t>
-      </w:r>
-      <w:r>
-        <w:t xml:space="preserve">NVM </w:t>
-      </w:r>
-      <w:r>
-        <w:t>适配应使用</w:t>
-      </w:r>
-      <w:r>
-        <w:t xml:space="preserve"> A/B </w:t>
-      </w:r>
-      <w:r>
-        <w:t>槽或追加日志、</w:t>
-      </w:r>
-      <w:r>
-        <w:t>generation</w:t>
-      </w:r>
-      <w:r>
-        <w:t>、</w:t>
-      </w:r>
-      <w:r>
-        <w:t>CRC/</w:t>
-      </w:r>
-      <w:r>
-        <w:t>认证校验和</w:t>
-      </w:r>
-      <w:r>
-        <w:t xml:space="preserve"> wear leveling</w:t>
-      </w:r>
-      <w:r>
-        <w:t>，并统计读次数、写次数、擦除次数、剩余寿命和持久化失败。</w:t>
+        <w:t>介质保护：NVM 适配应使用 A/B 槽或追加日志、generation、CRC/认证校验和 wear leveling，并统计读次数、写次数、擦除次数、剩余寿命和持久化失败。</w:t>
       </w:r>
     </w:p>
     <w:p>
@@ -4975,34 +4916,6 @@
           <w:lang w:eastAsia="zh-CN"/>
         </w:rPr>
         <w:t>安全底线：不得返回“提交成功”后再异步补写；NVM 状态不确定时必须关闭式拒绝。</w:t>
-      </w:r>
-      <w:r>
-        <w:rPr>
-          <w:b/>
-          <w:color w:val="9B1C1C"/>
-          <w:lang w:eastAsia="zh-CN"/>
-        </w:rPr>
-      </w:r>
-      <w:r>
-        <w:rPr>
-          <w:b/>
-          <w:color w:val="9B1C1C"/>
-          <w:lang w:eastAsia="zh-CN"/>
-        </w:rPr>
-      </w:r>
-      <w:r>
-        <w:rPr>
-          <w:b/>
-          <w:color w:val="9B1C1C"/>
-          <w:lang w:eastAsia="zh-CN"/>
-        </w:rPr>
-      </w:r>
-      <w:r>
-        <w:rPr>
-          <w:b/>
-          <w:color w:val="9B1C1C"/>
-          <w:lang w:eastAsia="zh-CN"/>
-        </w:rPr>
       </w:r>
     </w:p>
     <w:p>
@@ -5279,6 +5192,7 @@
       <w:pPr>
         <w:pStyle w:val="a"/>
         <w:numPr>
+          <w:ilvl w:val="0"/>
           <w:numId w:val="10"/>
         </w:numPr>
         <w:rPr>
@@ -5293,6 +5207,7 @@
       <w:pPr>
         <w:pStyle w:val="a"/>
         <w:numPr>
+          <w:ilvl w:val="0"/>
           <w:numId w:val="10"/>
         </w:numPr>
         <w:rPr>
@@ -5307,6 +5222,7 @@
       <w:pPr>
         <w:pStyle w:val="a"/>
         <w:numPr>
+          <w:ilvl w:val="0"/>
           <w:numId w:val="10"/>
         </w:numPr>
         <w:rPr>
@@ -5321,6 +5237,7 @@
       <w:pPr>
         <w:pStyle w:val="a"/>
         <w:numPr>
+          <w:ilvl w:val="0"/>
           <w:numId w:val="10"/>
         </w:numPr>
         <w:rPr>
@@ -5335,6 +5252,7 @@
       <w:pPr>
         <w:pStyle w:val="a"/>
         <w:numPr>
+          <w:ilvl w:val="0"/>
           <w:numId w:val="10"/>
         </w:numPr>
         <w:rPr>
@@ -7020,11 +6938,13 @@
               <w:spacing w:after="0" w:line="259" w:lineRule="auto"/>
               <w:rPr>
                 <w:rFonts w:hint="eastAsia"/>
+                <w:lang w:eastAsia="zh-CN"/>
               </w:rPr>
             </w:pPr>
             <w:r>
               <w:rPr>
                 <w:sz w:val="17"/>
+                <w:lang w:eastAsia="zh-CN"/>
               </w:rPr>
               <w:t>安全处理及必要持久化均成功</w:t>
             </w:r>
@@ -7123,11 +7043,13 @@
               <w:spacing w:after="0" w:line="259" w:lineRule="auto"/>
               <w:rPr>
                 <w:rFonts w:hint="eastAsia"/>
+                <w:lang w:eastAsia="zh-CN"/>
               </w:rPr>
             </w:pPr>
             <w:r>
               <w:rPr>
                 <w:sz w:val="17"/>
+                <w:lang w:eastAsia="zh-CN"/>
               </w:rPr>
               <w:t>处理成功且发生安全关联切换</w:t>
             </w:r>
@@ -7303,6 +7225,7 @@
               <w:rPr>
                 <w:sz w:val="17"/>
               </w:rPr>
+              <w:lastRenderedPageBreak/>
               <w:t>调用条件或配置错误</w:t>
             </w:r>
           </w:p>
@@ -7400,11 +7323,13 @@
               <w:spacing w:after="0" w:line="259" w:lineRule="auto"/>
               <w:rPr>
                 <w:rFonts w:hint="eastAsia"/>
+                <w:lang w:eastAsia="zh-CN"/>
               </w:rPr>
             </w:pPr>
             <w:r>
               <w:rPr>
                 <w:sz w:val="17"/>
+                <w:lang w:eastAsia="zh-CN"/>
               </w:rPr>
               <w:t>完整帧或 FECF 失败</w:t>
             </w:r>
@@ -7537,11 +7462,13 @@
               <w:spacing w:after="0" w:line="259" w:lineRule="auto"/>
               <w:rPr>
                 <w:rFonts w:hint="eastAsia"/>
+                <w:lang w:eastAsia="zh-CN"/>
               </w:rPr>
             </w:pPr>
             <w:r>
               <w:rPr>
                 <w:sz w:val="17"/>
+                <w:lang w:eastAsia="zh-CN"/>
               </w:rPr>
               <w:t>安全关联不存在、检测到重放或 IV 前跳超限</w:t>
             </w:r>
@@ -7743,11 +7670,13 @@
               <w:spacing w:after="0" w:line="259" w:lineRule="auto"/>
               <w:rPr>
                 <w:rFonts w:hint="eastAsia"/>
+                <w:lang w:eastAsia="zh-CN"/>
               </w:rPr>
             </w:pPr>
             <w:r>
               <w:rPr>
                 <w:sz w:val="17"/>
+                <w:lang w:eastAsia="zh-CN"/>
               </w:rPr>
               <w:t>运行资源不足或持久化保证未建立</w:t>
             </w:r>
@@ -7854,9 +7783,13 @@
         <w:pStyle w:val="a0"/>
         <w:rPr>
           <w:rFonts w:hint="eastAsia"/>
+          <w:lang w:eastAsia="zh-CN"/>
         </w:rPr>
       </w:pPr>
       <w:r>
+        <w:rPr>
+          <w:lang w:eastAsia="zh-CN"/>
+        </w:rPr>
         <w:t>密码模块状态上下文由星务托管。若多任务共享同一上下文，星务必须串行化密码处理；不得让两个帧并发修改同一 replay/epoch 状态。</w:t>
       </w:r>
     </w:p>
@@ -7865,9 +7798,13 @@
         <w:pStyle w:val="a0"/>
         <w:rPr>
           <w:rFonts w:hint="eastAsia"/>
+          <w:lang w:eastAsia="zh-CN"/>
         </w:rPr>
       </w:pPr>
       <w:r>
+        <w:rPr>
+          <w:lang w:eastAsia="zh-CN"/>
+        </w:rPr>
         <w:t>明文交付方式由详细设计确定；资源不足时必须整体失败，不得截断、部分交付或在失败路径残留明文。</w:t>
       </w:r>
     </w:p>
@@ -7921,6 +7858,7 @@
         <w:pStyle w:val="1"/>
       </w:pPr>
       <w:r>
+        <w:lastRenderedPageBreak/>
         <w:t xml:space="preserve">9. </w:t>
       </w:r>
       <w:r>
@@ -8050,7 +7988,6 @@
               <w:rPr>
                 <w:sz w:val="18"/>
               </w:rPr>
-              <w:lastRenderedPageBreak/>
               <w:t>SR-01</w:t>
             </w:r>
           </w:p>
@@ -8501,11 +8438,13 @@
               <w:spacing w:after="0" w:line="259" w:lineRule="auto"/>
               <w:rPr>
                 <w:rFonts w:hint="eastAsia"/>
+                <w:lang w:eastAsia="zh-CN"/>
               </w:rPr>
             </w:pPr>
             <w:r>
               <w:rPr>
                 <w:sz w:val="18"/>
+                <w:lang w:eastAsia="zh-CN"/>
               </w:rPr>
               <w:t>执行模块清理、初始化失败或致命故障隔离时，应清零敏感上下文与暂存明文。</w:t>
             </w:r>
@@ -8883,6 +8822,7 @@
         <w:rPr>
           <w:b/>
           <w:color w:val="9B1C1C"/>
+          <w:lang w:eastAsia="zh-CN"/>
         </w:rPr>
         <w:t>风险声明  普通 CTR 无 Tag，FECF、Replay 与明文格式校验均不能替代密码学完整性；当前设计必须作为受限 Profile 明确接受剩余风险。若任务威胁模型要求抵抗主动篡改，应增加 GCM/CMAC Tag 或依赖覆盖完整帧的外部认证链路。</w:t>
       </w:r>
@@ -9158,6 +9098,7 @@
               <w:rPr>
                 <w:sz w:val="18"/>
               </w:rPr>
+              <w:lastRenderedPageBreak/>
               <w:t>L2 主机端到端</w:t>
             </w:r>
           </w:p>
@@ -9349,6 +9290,7 @@
         <w:rPr>
           <w:b/>
           <w:color w:val="17365D"/>
+          <w:lang w:eastAsia="zh-CN"/>
         </w:rPr>
         <w:t>验收必须区分随机链路差错、重放、CTR 主动篡改和 Recovery GCM 认证失败；不得把明文格式拒绝统计为密码学认证成功。</w:t>
       </w:r>
@@ -9395,9 +9337,13 @@
         <w:pStyle w:val="a0"/>
         <w:rPr>
           <w:rFonts w:hint="eastAsia"/>
+          <w:lang w:eastAsia="zh-CN"/>
         </w:rPr>
       </w:pPr>
       <w:r>
+        <w:rPr>
+          <w:lang w:eastAsia="zh-CN"/>
+        </w:rPr>
         <w:t>Next 自动提升：首个合法 Next 帧触发安全关联切换并作为普通成功帧处理，旧 SPI 随即拒绝。</w:t>
       </w:r>
     </w:p>
@@ -10351,6 +10297,7 @@
               <w:rPr>
                 <w:sz w:val="17"/>
               </w:rPr>
+              <w:lastRenderedPageBreak/>
               <w:t>P2</w:t>
             </w:r>
           </w:p>
@@ -10595,10 +10542,14 @@
       <w:tr>
         <w:tc>
           <w:tcPr>
-            <w:tcW w:type="dxa" w:w="900"/>
-          </w:tcPr>
-          <w:p>
-            <w:pPr/>
+            <w:tcW w:w="900" w:type="dxa"/>
+          </w:tcPr>
+          <w:p>
+            <w:pPr>
+              <w:rPr>
+                <w:rFonts w:hint="eastAsia"/>
+              </w:rPr>
+            </w:pPr>
             <w:r>
               <w:t>P0</w:t>
             </w:r>
@@ -10606,34 +10557,108 @@
         </w:tc>
         <w:tc>
           <w:tcPr>
-            <w:tcW w:type="dxa" w:w="3860"/>
-          </w:tcPr>
-          <w:p>
-            <w:pPr/>
-            <w:r>
-              <w:t>普通 CTR 无 Tag 的剩余风险接受或认证升级方案</w:t>
-            </w:r>
-          </w:p>
-        </w:tc>
-        <w:tc>
-          <w:tcPr>
-            <w:tcW w:type="dxa" w:w="1800"/>
-          </w:tcPr>
-          <w:p>
-            <w:pPr/>
-            <w:r>
-              <w:t>总体 + 安全 + 测控</w:t>
-            </w:r>
-          </w:p>
-        </w:tc>
-        <w:tc>
-          <w:tcPr>
-            <w:tcW w:type="dxa" w:w="2800"/>
-          </w:tcPr>
-          <w:p>
-            <w:pPr/>
-            <w:r>
-              <w:t>威胁模型、风险接受记录或 GCM/CMAC/外部认证 ICD</w:t>
+            <w:tcW w:w="3860" w:type="dxa"/>
+          </w:tcPr>
+          <w:p>
+            <w:pPr>
+              <w:rPr>
+                <w:rFonts w:hint="eastAsia"/>
+                <w:lang w:eastAsia="zh-CN"/>
+              </w:rPr>
+            </w:pPr>
+            <w:r>
+              <w:rPr>
+                <w:lang w:eastAsia="zh-CN"/>
+              </w:rPr>
+              <w:t>普通</w:t>
+            </w:r>
+            <w:r>
+              <w:rPr>
+                <w:lang w:eastAsia="zh-CN"/>
+              </w:rPr>
+              <w:t xml:space="preserve"> CTR </w:t>
+            </w:r>
+            <w:r>
+              <w:rPr>
+                <w:lang w:eastAsia="zh-CN"/>
+              </w:rPr>
+              <w:t>无</w:t>
+            </w:r>
+            <w:r>
+              <w:rPr>
+                <w:lang w:eastAsia="zh-CN"/>
+              </w:rPr>
+              <w:t xml:space="preserve"> Tag </w:t>
+            </w:r>
+            <w:r>
+              <w:rPr>
+                <w:lang w:eastAsia="zh-CN"/>
+              </w:rPr>
+              <w:t>的剩余风险接受或认证升级方案</w:t>
+            </w:r>
+          </w:p>
+        </w:tc>
+        <w:tc>
+          <w:tcPr>
+            <w:tcW w:w="1800" w:type="dxa"/>
+          </w:tcPr>
+          <w:p>
+            <w:pPr>
+              <w:rPr>
+                <w:rFonts w:hint="eastAsia"/>
+              </w:rPr>
+            </w:pPr>
+            <w:r>
+              <w:t>总体</w:t>
+            </w:r>
+            <w:r>
+              <w:t xml:space="preserve"> + </w:t>
+            </w:r>
+            <w:r>
+              <w:t>安全</w:t>
+            </w:r>
+            <w:r>
+              <w:t xml:space="preserve"> + </w:t>
+            </w:r>
+            <w:r>
+              <w:t>测控</w:t>
+            </w:r>
+          </w:p>
+        </w:tc>
+        <w:tc>
+          <w:tcPr>
+            <w:tcW w:w="2800" w:type="dxa"/>
+          </w:tcPr>
+          <w:p>
+            <w:pPr>
+              <w:rPr>
+                <w:rFonts w:hint="eastAsia"/>
+                <w:lang w:eastAsia="zh-CN"/>
+              </w:rPr>
+            </w:pPr>
+            <w:r>
+              <w:rPr>
+                <w:lang w:eastAsia="zh-CN"/>
+              </w:rPr>
+              <w:t>威胁模型、风险接受记录或</w:t>
+            </w:r>
+            <w:r>
+              <w:rPr>
+                <w:lang w:eastAsia="zh-CN"/>
+              </w:rPr>
+              <w:t xml:space="preserve"> GCM/CMAC/</w:t>
+            </w:r>
+            <w:r>
+              <w:rPr>
+                <w:lang w:eastAsia="zh-CN"/>
+              </w:rPr>
+              <w:t>外部认证</w:t>
+            </w:r>
+            <w:r>
+              <w:rPr>
+                <w:lang w:eastAsia="zh-CN"/>
+              </w:rPr>
+              <w:t xml:space="preserve"> ICD</w:t>
             </w:r>
           </w:p>
         </w:tc>
@@ -10781,7 +10806,6 @@
               <w:rPr>
                 <w:sz w:val="18"/>
               </w:rPr>
-              <w:lastRenderedPageBreak/>
               <w:t>Security Association（SA）</w:t>
             </w:r>
           </w:p>
@@ -11334,6 +11358,7 @@
         <w:rPr>
           <w:lang w:eastAsia="zh-CN"/>
         </w:rPr>
+        <w:lastRenderedPageBreak/>
         <w:t>附录</w:t>
       </w:r>
       <w:r>
@@ -11770,7 +11795,7 @@
   <w:num w:numId="9" w16cid:durableId="904993322">
     <w:abstractNumId w:val="0"/>
   </w:num>
-  <w:num w:numId="10">
+  <w:num w:numId="10" w16cid:durableId="1277710409">
     <w:abstractNumId w:val="7"/>
     <w:lvlOverride w:ilvl="0">
       <w:startOverride w:val="1"/>

</xml_diff>